<commit_message>
Remove sports from the letterhead
Keep only the logo and organization details on the blank.
</commit_message>
<xml_diff>
--- a/docs/Blank_Inter_Select_Pro.docx
+++ b/docs/Blank_Inter_Select_Pro.docx
@@ -128,23 +128,7 @@
     </w:p>
     <w:p>
       <w:pPr>
-        <w:spacing w:before="120" w:after="40" w:line="240" w:lineRule="auto"/>
-        <w:jc w:val="center"/>
-      </w:pPr>
-      <w:r>
-        <w:rPr>
-          <w:rFonts w:ascii="Times New Roman" w:hAnsi="Times New Roman" w:eastAsia="Times New Roman"/>
-          <w:b w:val="0"/>
-          <w:i w:val="0"/>
-          <w:color w:val="5C6874"/>
-          <w:sz w:val="20"/>
-        </w:rPr>
-        <w:t>Хоккей  ·  Футбол  ·  Баскетбол  ·  Водное поло  ·  Фигурное катание  ·  Гольф</w:t>
-      </w:r>
-    </w:p>
-    <w:p>
-      <w:pPr>
-        <w:spacing w:before="40" w:after="160" w:line="240" w:lineRule="auto"/>
+        <w:spacing w:before="120" w:after="160" w:line="240" w:lineRule="auto"/>
         <w:jc w:val="center"/>
       </w:pPr>
       <w:r>

</xml_diff>